<commit_message>
Add code availability statement and repository metadata
</commit_message>
<xml_diff>
--- a/outputs/tables/main_manuscript_Chinese_final.docx
+++ b/outputs/tables/main_manuscript_Chinese_final.docx
@@ -5516,6 +5516,16 @@
       </w:r>
     </w:p>
     <w:p>
+      <w:r>
+        <w:t>代码可用性</w:t>
+      </w:r>
+    </w:p>
+    <w:p>
+      <w:r>
+        <w:t>本研究的分析代码、公开聚合结果文件、图片生成脚本、验证测试和复现说明可在https://github.com/FENG1567/nrd-index-discharge-cholecystectomy 获取。仓库不包含受许可限制的HCUP/NRD原始记录、患者级数据、凭据、密码或医院标识。</w:t>
+      </w:r>
+    </w:p>
+    <w:p>
       <w:pPr>
         <w:spacing w:before="0"/>
       </w:pPr>

</xml_diff>

<commit_message>
Improve Figure 6 panel layout and captions
</commit_message>
<xml_diff>
--- a/outputs/tables/main_manuscript_Chinese_final.docx
+++ b/outputs/tables/main_manuscript_Chinese_final.docx
@@ -5397,11 +5397,6 @@
     </w:p>
     <w:p>
       <w:r>
-        <w:t>图6。年度队列与医院年度实践摘要。（a）年度合格队列规模；（b）年度观察到的主结局事件数；（c）医院年度胆囊切除完成率的聚合范围。所有医院面板均为描述性汇总，不构成医院质量排名或因果比较。</w:t>
-      </w:r>
-    </w:p>
-    <w:p>
-      <w:r>
         <w:t>图5和图6补充了主结果的效应尺度、年度构成与医院实践背景；这些面板不改变主要估计目标。</w:t>
       </w:r>
     </w:p>

</xml_diff>